<commit_message>
Republish spec from corrected DACS-v0.1 source
The first publish was built from an older draft whose front matter still read
'paper v0.8 / DACS-1..5 v0.2' and per-stage 'Status: Draft v0.2' — contradicting
the CHANGELOG, which states v0.1 collapses to a single document-level version.

Regenerates spec/SPECIFICATION.md and spec/DACS-Specification-v0.1.docx from the
corrected source (single-version framing, 'first publicly released version').
Source verified comment-free and tracked-change-free. spec/README versioning
language updated to match.

Co-Authored-By: Claude Opus 4.8 (1M context) <noreply@anthropic.com>
</commit_message>
<xml_diff>
--- a/spec/DACS-Specification-v0.1.docx
+++ b/spec/DACS-Specification-v0.1.docx
@@ -55,7 +55,7 @@
           <w:sz w:val="22"/>
           <w:szCs w:val="22"/>
         </w:rPr>
-        <w:t xml:space="preserve">Draft — paper v0.8 + DACS-1..5 v0.2 reconciled</w:t>
+        <w:t xml:space="preserve">Draft — DACS v0.1</w:t>
       </w:r>
     </w:p>
     <w:p>
@@ -212,10 +212,20 @@
           <w:b/>
           <w:bCs/>
         </w:rPr>
-        <w:t xml:space="preserve">Version coupling.</w:t>
-      </w:r>
-      <w:r>
-        <w:t xml:space="preserve"> This document is paper v0.8 and DACS-1..5 v0.2. Each per-stage specification versions independently; the highest-published minor version per stage MUST be coherent with the paper version cited in its front matter.</w:t>
+        <w:t xml:space="preserve">Versioning.</w:t>
+      </w:r>
+      <w:r>
+        <w:t xml:space="preserve"> This document is </w:t>
+      </w:r>
+      <w:r>
+        <w:rPr>
+          <w:b/>
+          <w:bCs/>
+        </w:rPr>
+        <w:t xml:space="preserve">DACS v0.1</w:t>
+      </w:r>
+      <w:r>
+        <w:t xml:space="preserve">, the first publicly released version. Earlier drafts circulated internally under per-stage version numbers (DACS-1..5 v0.1, paper v0.7) and a brief v0.8 cut that consolidated review-pass revisions; those numbers are retired in favour of a single document-level version. From v0.1 onward, the entire DACS standard (all five per-stage standards plus the front-matter substrate-binding, the threat model, the glossary, and the conformance plan) versions together. Per-stage specs do not version independently. Future versions will be v0.2, v0.3, and so on through to v1.0 once the standard is considered ready for unsupervised production use.</w:t>
       </w:r>
     </w:p>
     <w:p>
@@ -6490,7 +6500,7 @@
         <w:t xml:space="preserve">Status:</w:t>
       </w:r>
       <w:r>
-        <w:t xml:space="preserve"> Draft v0.2. </w:t>
+        <w:t xml:space="preserve"> Draft (part of DACS v0.1). </w:t>
       </w:r>
       <w:r>
         <w:rPr>
@@ -13242,7 +13252,7 @@
         <w:t xml:space="preserve">Status:</w:t>
       </w:r>
       <w:r>
-        <w:t xml:space="preserve"> Draft v0.2. </w:t>
+        <w:t xml:space="preserve"> Draft (part of DACS v0.1). </w:t>
       </w:r>
       <w:r>
         <w:rPr>
@@ -20082,7 +20092,7 @@
         <w:t xml:space="preserve">Status:</w:t>
       </w:r>
       <w:r>
-        <w:t xml:space="preserve"> Draft v0.2. </w:t>
+        <w:t xml:space="preserve"> Draft (part of DACS v0.1). </w:t>
       </w:r>
       <w:r>
         <w:rPr>
@@ -24116,7 +24126,7 @@
         <w:t xml:space="preserve">Status:</w:t>
       </w:r>
       <w:r>
-        <w:t xml:space="preserve"> Draft v0.2. </w:t>
+        <w:t xml:space="preserve"> Draft (part of DACS v0.1). </w:t>
       </w:r>
       <w:r>
         <w:rPr>
@@ -30195,7 +30205,7 @@
         <w:t xml:space="preserve">Status:</w:t>
       </w:r>
       <w:r>
-        <w:t xml:space="preserve"> Draft v0.2. </w:t>
+        <w:t xml:space="preserve"> Draft (part of DACS v0.1). </w:t>
       </w:r>
       <w:r>
         <w:rPr>
@@ -33797,7 +33807,17 @@
         <w:spacing w:after="120"/>
       </w:pPr>
       <w:r>
-        <w:t xml:space="preserve">Each per-stage standard (DACS-1 through DACS-5) versions independently. Major versions break compatibility; minor versions add capabilities while preserving forward-readable shapes. The introduction paper version (currently 0.8) is the conceptual anchor; per-stage specs cite the paper version they are coherent with. v1 freezes the registries (claim schemes in DACS-1, methods/recipes in DACS-2, patterns in DACS-3, rails in DACS-4); additions happen via minor-version registry updates released by the current steward.</w:t>
+        <w:t xml:space="preserve">DACS uses a single document-level version. The entire standard — all five per-stage standards, front-matter substrate-binding, threat model, glossary, conformance plan — versions together. This document is </w:t>
+      </w:r>
+      <w:r>
+        <w:rPr>
+          <w:b/>
+          <w:bCs/>
+        </w:rPr>
+        <w:t xml:space="preserve">DACS v0.1</w:t>
+      </w:r>
+      <w:r>
+        <w:t xml:space="preserve">, the first publicly released version. Major versions (v1, v2, …) break compatibility; minor versions (v0.2, v0.3, …) add capabilities while preserving forward-readable shapes. v0.1 freezes the registries (claim schemes in DACS-1, methods/recipes in DACS-2, patterns in DACS-3, rails in DACS-4); additions happen via minor-version registry updates released by the current steward. v1 is the version at which the standard is considered ready for unsupervised production use.</w:t>
       </w:r>
     </w:p>
     <w:p>

</xml_diff>